<commit_message>
refactor: regenerate realistic benchmark fixtures with arabic fonts
</commit_message>
<xml_diff>
--- a/test_documents/10_docx_engine_fixture.docx
+++ b/test_documents/10_docx_engine_fixture.docx
@@ -30,15 +30,21 @@
         <w:t xml:space="preserve"> </w:t>
       </w:r>
       <m:oMath>
-        <m:r>
-          <m:t>e</m:t>
-        </m:r>
-        <m:r>
-          <m:t>i</m:t>
-        </m:r>
-        <m:r>
-          <m:t>x</m:t>
-        </m:r>
+        <m:sSup>
+          <m:e>
+            <m:r>
+              <m:t>e</m:t>
+            </m:r>
+          </m:e>
+          <m:sup>
+            <m:r>
+              <m:t>i</m:t>
+            </m:r>
+            <m:r>
+              <m:t>x</m:t>
+            </m:r>
+          </m:sup>
+        </m:sSup>
         <m:r>
           <m:rPr>
             <m:sty m:val="p"/>
@@ -79,6 +85,123 @@
       <w:r>
         <w:t xml:space="preserve">must survive.</w:t>
       </w:r>
+    </w:p>
+    <w:p>
+      <w:pPr>
+        <w:pStyle w:val="BodyText"/>
+      </w:pPr>
+      <w:r>
+        <w:t xml:space="preserve">Inline shell variables such as</w:t>
+      </w:r>
+      <w:r>
+        <w:t xml:space="preserve"> </w:t>
+      </w:r>
+      <w:r>
+        <w:rPr>
+          <w:rStyle w:val="VerbatimChar"/>
+        </w:rPr>
+        <w:t xml:space="preserve">$PATH</w:t>
+      </w:r>
+      <w:r>
+        <w:t xml:space="preserve"> </w:t>
+      </w:r>
+      <w:r>
+        <w:t xml:space="preserve">and</w:t>
+      </w:r>
+      <w:r>
+        <w:t xml:space="preserve"> </w:t>
+      </w:r>
+      <w:r>
+        <w:rPr>
+          <w:rStyle w:val="VerbatimChar"/>
+        </w:rPr>
+        <w:t xml:space="preserve">$HOME</w:t>
+      </w:r>
+      <w:r>
+        <w:t xml:space="preserve"> </w:t>
+      </w:r>
+      <w:r>
+        <w:t xml:space="preserve">are code spans and must never be rewritten as math, and currency like $5.00 stays escaped.</w:t>
+      </w:r>
+    </w:p>
+    <w:p>
+      <w:pPr>
+        <w:pStyle w:val="BodyText"/>
+      </w:pPr>
+      <w:r>
+        <w:t xml:space="preserve">Second paragraph with a display formula:</w:t>
+      </w:r>
+    </w:p>
+    <w:p>
+      <w:pPr>
+        <w:pStyle w:val="BodyText"/>
+      </w:pPr>
+      <m:oMathPara>
+        <m:oMathParaPr>
+          <m:jc m:val="center"/>
+        </m:oMathParaPr>
+        <m:oMath>
+          <m:nary>
+            <m:naryPr>
+              <m:chr m:val="∫"/>
+              <m:limLoc m:val="subSup"/>
+              <m:subHide m:val="off"/>
+              <m:supHide m:val="off"/>
+            </m:naryPr>
+            <m:sub>
+              <m:r>
+                <m:t>0</m:t>
+              </m:r>
+            </m:sub>
+            <m:sup>
+              <m:r>
+                <m:rPr>
+                  <m:sty m:val="p"/>
+                </m:rPr>
+                <m:t>∞</m:t>
+              </m:r>
+            </m:sup>
+            <m:e>
+              <m:sSup>
+                <m:e>
+                  <m:r>
+                    <m:t>e</m:t>
+                  </m:r>
+                </m:e>
+                <m:sup>
+                  <m:r>
+                    <m:rPr>
+                      <m:sty m:val="p"/>
+                    </m:rPr>
+                    <m:t>−</m:t>
+                  </m:r>
+                  <m:r>
+                    <m:t>t</m:t>
+                  </m:r>
+                </m:sup>
+              </m:sSup>
+            </m:e>
+          </m:nary>
+          <m:r>
+            <m:t> </m:t>
+          </m:r>
+          <m:r>
+            <m:t>d</m:t>
+          </m:r>
+          <m:r>
+            <m:t>t</m:t>
+          </m:r>
+          <m:r>
+            <m:rPr>
+              <m:sty m:val="p"/>
+            </m:rPr>
+            <m:t>=</m:t>
+          </m:r>
+          <m:r>
+            <m:t>1</m:t>
+          </m:r>
+        </m:oMath>
+      </m:oMathPara>
     </w:p>
     <w:bookmarkEnd w:id="9"/>
     <w:sectPr>

</xml_diff>

<commit_message>
fix: harden phase 2.1 conversion remediation
</commit_message>
<xml_diff>
--- a/test_documents/10_docx_engine_fixture.docx
+++ b/test_documents/10_docx_engine_fixture.docx
@@ -16,7 +16,7 @@
         <w:pStyle w:val="FirstParagraph"/>
       </w:pPr>
       <w:r>
-        <w:t xml:space="preserve">Pandoc converts this document to GitHub flavored markdown.</w:t>
+        <w:t xml:space="preserve">This multi-page document exercises Pandoc’s OOXML reader at a realistic scale.</w:t>
       </w:r>
     </w:p>
     <w:p>
@@ -129,7 +129,7 @@
         <w:pStyle w:val="BodyText"/>
       </w:pPr>
       <w:r>
-        <w:t xml:space="preserve">Second paragraph with a display formula:</w:t>
+        <w:t xml:space="preserve">A display formula must remain a Math AST node before the GFM writer runs:</w:t>
       </w:r>
     </w:p>
     <w:p>
@@ -202,6 +202,838 @@
           </m:r>
         </m:oMath>
       </m:oMathPara>
+    </w:p>
+    <w:p>
+      <w:pPr>
+        <w:pStyle w:val="FirstParagraph"/>
+      </w:pPr>
+      <w:r>
+        <w:t xml:space="preserve">This document verifies plain body text extraction at real-world scale.</w:t>
+      </w:r>
+    </w:p>
+    <w:p>
+      <w:pPr>
+        <w:pStyle w:val="BodyText"/>
+      </w:pPr>
+      <w:r>
+        <w:t xml:space="preserve">The pipeline must convert every paragraph to markdown without losing words</w:t>
+      </w:r>
+    </w:p>
+    <w:p>
+      <w:pPr>
+        <w:pStyle w:val="BodyText"/>
+      </w:pPr>
+      <w:r>
+        <w:t xml:space="preserve">or inserting phantom symbols, and it must do so deterministically.</w:t>
+      </w:r>
+    </w:p>
+    <w:p>
+      <w:pPr>
+        <w:pStyle w:val="BodyText"/>
+      </w:pPr>
+      <w:r>
+        <w:t xml:space="preserve">Sequential queue workers process files one by one so the memory footprint</w:t>
+      </w:r>
+    </w:p>
+    <w:p>
+      <w:pPr>
+        <w:pStyle w:val="BodyText"/>
+      </w:pPr>
+      <w:r>
+        <w:t xml:space="preserve">returns to baseline after each item and allocation stays predictable.</w:t>
+      </w:r>
+    </w:p>
+    <w:p>
+      <w:pPr>
+        <w:pStyle w:val="BodyText"/>
+      </w:pPr>
+      <w:r>
+        <w:t xml:space="preserve">Benchmarking measures character counts and latency for every document</w:t>
+      </w:r>
+    </w:p>
+    <w:p>
+      <w:pPr>
+        <w:pStyle w:val="BodyText"/>
+      </w:pPr>
+      <w:r>
+        <w:t xml:space="preserve">in the suite, and the results are reported in a machine-readable phase</w:t>
+      </w:r>
+    </w:p>
+    <w:p>
+      <w:pPr>
+        <w:pStyle w:val="BodyText"/>
+      </w:pPr>
+      <w:r>
+        <w:t xml:space="preserve">report that is verified by the delivery gate before completion.</w:t>
+      </w:r>
+    </w:p>
+    <w:p>
+      <w:pPr>
+        <w:pStyle w:val="BodyText"/>
+      </w:pPr>
+      <w:r>
+        <w:t xml:space="preserve">Native Rust compilation is delegated to the GitHub Actions runner while</w:t>
+      </w:r>
+    </w:p>
+    <w:p>
+      <w:pPr>
+        <w:pStyle w:val="BodyText"/>
+      </w:pPr>
+      <w:r>
+        <w:t xml:space="preserve">the local machine keeps a lightweight toolchain for scripts and tests.</w:t>
+      </w:r>
+    </w:p>
+    <w:p>
+      <w:pPr>
+        <w:pStyle w:val="BodyText"/>
+      </w:pPr>
+      <w:r>
+        <w:t xml:space="preserve">Artifacts are verified for presence and size before a phase report may</w:t>
+      </w:r>
+    </w:p>
+    <w:p>
+      <w:pPr>
+        <w:pStyle w:val="BodyText"/>
+      </w:pPr>
+      <w:r>
+        <w:t xml:space="preserve">be marked complete, and cache keys isolate test builds from releases.</w:t>
+      </w:r>
+    </w:p>
+    <w:p>
+      <w:pPr>
+        <w:pStyle w:val="BodyText"/>
+      </w:pPr>
+      <w:r>
+        <w:t xml:space="preserve">The graphical shell follows Apple design guidelines with a fixed window</w:t>
+      </w:r>
+    </w:p>
+    <w:p>
+      <w:pPr>
+        <w:pStyle w:val="BodyText"/>
+      </w:pPr>
+      <w:r>
+        <w:t xml:space="preserve">size, a deep dark theme, and minimalist status indicators.</w:t>
+      </w:r>
+    </w:p>
+    <w:p>
+      <w:pPr>
+        <w:pStyle w:val="BodyText"/>
+      </w:pPr>
+      <w:r>
+        <w:t xml:space="preserve">Documents with mixed scripts, complex tables, and embedded images are</w:t>
+      </w:r>
+    </w:p>
+    <w:p>
+      <w:pPr>
+        <w:pStyle w:val="BodyText"/>
+      </w:pPr>
+      <w:r>
+        <w:t xml:space="preserve">exercised so that regressions cannot hide behind toy-sized fixtures.</w:t>
+      </w:r>
+    </w:p>
+    <w:p>
+      <w:pPr>
+        <w:pStyle w:val="BodyText"/>
+      </w:pPr>
+      <w:r>
+        <w:t xml:space="preserve">Encrypted files return a structured failure, and password-protected</w:t>
+      </w:r>
+    </w:p>
+    <w:p>
+      <w:pPr>
+        <w:pStyle w:val="BodyText"/>
+      </w:pPr>
+      <w:r>
+        <w:t xml:space="preserve">content is never written to disk unless authentication succeeds.</w:t>
+      </w:r>
+    </w:p>
+    <w:p>
+      <w:pPr>
+        <w:pStyle w:val="BodyText"/>
+      </w:pPr>
+      <w:r>
+        <w:t xml:space="preserve">Long-running conversions can be cancelled by the user at any moment and</w:t>
+      </w:r>
+    </w:p>
+    <w:p>
+      <w:pPr>
+        <w:pStyle w:val="BodyText"/>
+      </w:pPr>
+      <w:r>
+        <w:t xml:space="preserve">the engine process is terminated promptly without leaking memory.</w:t>
+      </w:r>
+    </w:p>
+    <w:p>
+      <w:pPr>
+        <w:pStyle w:val="BodyText"/>
+      </w:pPr>
+      <w:r>
+        <w:t xml:space="preserve">The watchdog deadline protects the queue from pathological documents</w:t>
+      </w:r>
+    </w:p>
+    <w:p>
+      <w:pPr>
+        <w:pStyle w:val="BodyText"/>
+      </w:pPr>
+      <w:r>
+        <w:t xml:space="preserve">that would otherwise stall conversion for hours.</w:t>
+      </w:r>
+    </w:p>
+    <w:p>
+      <w:pPr>
+        <w:pStyle w:val="BodyText"/>
+      </w:pPr>
+      <w:r>
+        <w:t xml:space="preserve">Paths containing spaces are handled correctly on Windows, including</w:t>
+      </w:r>
+    </w:p>
+    <w:p>
+      <w:pPr>
+        <w:pStyle w:val="BodyText"/>
+      </w:pPr>
+      <w:r>
+        <w:t xml:space="preserve">folders such as My Documents that are common in real deployments.</w:t>
+      </w:r>
+    </w:p>
+    <w:p>
+      <w:pPr>
+        <w:pStyle w:val="BodyText"/>
+      </w:pPr>
+      <w:r>
+        <w:t xml:space="preserve">Every release artifact is a single lightweight installer that runs</w:t>
+      </w:r>
+    </w:p>
+    <w:p>
+      <w:pPr>
+        <w:pStyle w:val="BodyText"/>
+      </w:pPr>
+      <w:r>
+        <w:t xml:space="preserve">fully offline with no telemetry and no cloud dependency.</w:t>
+      </w:r>
+    </w:p>
+    <w:p>
+      <w:pPr>
+        <w:pStyle w:val="BodyText"/>
+      </w:pPr>
+      <w:r>
+        <w:t xml:space="preserve">This document verifies plain body text extraction at real-world scale.</w:t>
+      </w:r>
+    </w:p>
+    <w:p>
+      <w:pPr>
+        <w:pStyle w:val="BodyText"/>
+      </w:pPr>
+      <w:r>
+        <w:t xml:space="preserve">The pipeline must convert every paragraph to markdown without losing words</w:t>
+      </w:r>
+    </w:p>
+    <w:p>
+      <w:pPr>
+        <w:pStyle w:val="BodyText"/>
+      </w:pPr>
+      <w:r>
+        <w:t xml:space="preserve">or inserting phantom symbols, and it must do so deterministically.</w:t>
+      </w:r>
+    </w:p>
+    <w:p>
+      <w:pPr>
+        <w:pStyle w:val="BodyText"/>
+      </w:pPr>
+      <w:r>
+        <w:t xml:space="preserve">Sequential queue workers process files one by one so the memory footprint</w:t>
+      </w:r>
+    </w:p>
+    <w:p>
+      <w:pPr>
+        <w:pStyle w:val="BodyText"/>
+      </w:pPr>
+      <w:r>
+        <w:t xml:space="preserve">returns to baseline after each item and allocation stays predictable.</w:t>
+      </w:r>
+    </w:p>
+    <w:p>
+      <w:pPr>
+        <w:pStyle w:val="BodyText"/>
+      </w:pPr>
+      <w:r>
+        <w:t xml:space="preserve">Benchmarking measures character counts and latency for every document</w:t>
+      </w:r>
+    </w:p>
+    <w:p>
+      <w:pPr>
+        <w:pStyle w:val="BodyText"/>
+      </w:pPr>
+      <w:r>
+        <w:t xml:space="preserve">in the suite, and the results are reported in a machine-readable phase</w:t>
+      </w:r>
+    </w:p>
+    <w:p>
+      <w:pPr>
+        <w:pStyle w:val="BodyText"/>
+      </w:pPr>
+      <w:r>
+        <w:t xml:space="preserve">report that is verified by the delivery gate before completion.</w:t>
+      </w:r>
+    </w:p>
+    <w:p>
+      <w:pPr>
+        <w:pStyle w:val="BodyText"/>
+      </w:pPr>
+      <w:r>
+        <w:t xml:space="preserve">Native Rust compilation is delegated to the GitHub Actions runner while</w:t>
+      </w:r>
+    </w:p>
+    <w:p>
+      <w:pPr>
+        <w:pStyle w:val="BodyText"/>
+      </w:pPr>
+      <w:r>
+        <w:t xml:space="preserve">the local machine keeps a lightweight toolchain for scripts and tests.</w:t>
+      </w:r>
+    </w:p>
+    <w:p>
+      <w:pPr>
+        <w:pStyle w:val="BodyText"/>
+      </w:pPr>
+      <w:r>
+        <w:t xml:space="preserve">Artifacts are verified for presence and size before a phase report may</w:t>
+      </w:r>
+    </w:p>
+    <w:p>
+      <w:pPr>
+        <w:pStyle w:val="BodyText"/>
+      </w:pPr>
+      <w:r>
+        <w:t xml:space="preserve">be marked complete, and cache keys isolate test builds from releases.</w:t>
+      </w:r>
+    </w:p>
+    <w:p>
+      <w:pPr>
+        <w:pStyle w:val="BodyText"/>
+      </w:pPr>
+      <w:r>
+        <w:t xml:space="preserve">The graphical shell follows Apple design guidelines with a fixed window</w:t>
+      </w:r>
+    </w:p>
+    <w:p>
+      <w:pPr>
+        <w:pStyle w:val="BodyText"/>
+      </w:pPr>
+      <w:r>
+        <w:t xml:space="preserve">size, a deep dark theme, and minimalist status indicators.</w:t>
+      </w:r>
+    </w:p>
+    <w:p>
+      <w:pPr>
+        <w:pStyle w:val="BodyText"/>
+      </w:pPr>
+      <w:r>
+        <w:t xml:space="preserve">Documents with mixed scripts, complex tables, and embedded images are</w:t>
+      </w:r>
+    </w:p>
+    <w:p>
+      <w:pPr>
+        <w:pStyle w:val="BodyText"/>
+      </w:pPr>
+      <w:r>
+        <w:t xml:space="preserve">exercised so that regressions cannot hide behind toy-sized fixtures.</w:t>
+      </w:r>
+    </w:p>
+    <w:p>
+      <w:pPr>
+        <w:pStyle w:val="BodyText"/>
+      </w:pPr>
+      <w:r>
+        <w:t xml:space="preserve">Encrypted files return a structured failure, and password-protected</w:t>
+      </w:r>
+    </w:p>
+    <w:p>
+      <w:pPr>
+        <w:pStyle w:val="BodyText"/>
+      </w:pPr>
+      <w:r>
+        <w:t xml:space="preserve">content is never written to disk unless authentication succeeds.</w:t>
+      </w:r>
+    </w:p>
+    <w:p>
+      <w:pPr>
+        <w:pStyle w:val="BodyText"/>
+      </w:pPr>
+      <w:r>
+        <w:t xml:space="preserve">Long-running conversions can be cancelled by the user at any moment and</w:t>
+      </w:r>
+    </w:p>
+    <w:p>
+      <w:pPr>
+        <w:pStyle w:val="BodyText"/>
+      </w:pPr>
+      <w:r>
+        <w:t xml:space="preserve">the engine process is terminated promptly without leaking memory.</w:t>
+      </w:r>
+    </w:p>
+    <w:p>
+      <w:pPr>
+        <w:pStyle w:val="BodyText"/>
+      </w:pPr>
+      <w:r>
+        <w:t xml:space="preserve">The watchdog deadline protects the queue from pathological documents</w:t>
+      </w:r>
+    </w:p>
+    <w:p>
+      <w:pPr>
+        <w:pStyle w:val="BodyText"/>
+      </w:pPr>
+      <w:r>
+        <w:t xml:space="preserve">that would otherwise stall conversion for hours.</w:t>
+      </w:r>
+    </w:p>
+    <w:p>
+      <w:pPr>
+        <w:pStyle w:val="BodyText"/>
+      </w:pPr>
+      <w:r>
+        <w:t xml:space="preserve">Paths containing spaces are handled correctly on Windows, including</w:t>
+      </w:r>
+    </w:p>
+    <w:p>
+      <w:pPr>
+        <w:pStyle w:val="BodyText"/>
+      </w:pPr>
+      <w:r>
+        <w:t xml:space="preserve">folders such as My Documents that are common in real deployments.</w:t>
+      </w:r>
+    </w:p>
+    <w:p>
+      <w:pPr>
+        <w:pStyle w:val="BodyText"/>
+      </w:pPr>
+      <w:r>
+        <w:t xml:space="preserve">Every release artifact is a single lightweight installer that runs</w:t>
+      </w:r>
+    </w:p>
+    <w:p>
+      <w:pPr>
+        <w:pStyle w:val="BodyText"/>
+      </w:pPr>
+      <w:r>
+        <w:t xml:space="preserve">fully offline with no telemetry and no cloud dependency.</w:t>
+      </w:r>
+    </w:p>
+    <w:p>
+      <w:pPr>
+        <w:pStyle w:val="BodyText"/>
+      </w:pPr>
+      <w:r>
+        <w:t xml:space="preserve">This document verifies plain body text extraction at real-world scale.</w:t>
+      </w:r>
+    </w:p>
+    <w:p>
+      <w:pPr>
+        <w:pStyle w:val="BodyText"/>
+      </w:pPr>
+      <w:r>
+        <w:t xml:space="preserve">The pipeline must convert every paragraph to markdown without losing words</w:t>
+      </w:r>
+    </w:p>
+    <w:p>
+      <w:pPr>
+        <w:pStyle w:val="BodyText"/>
+      </w:pPr>
+      <w:r>
+        <w:t xml:space="preserve">or inserting phantom symbols, and it must do so deterministically.</w:t>
+      </w:r>
+    </w:p>
+    <w:p>
+      <w:pPr>
+        <w:pStyle w:val="BodyText"/>
+      </w:pPr>
+      <w:r>
+        <w:t xml:space="preserve">Sequential queue workers process files one by one so the memory footprint</w:t>
+      </w:r>
+    </w:p>
+    <w:p>
+      <w:pPr>
+        <w:pStyle w:val="BodyText"/>
+      </w:pPr>
+      <w:r>
+        <w:t xml:space="preserve">returns to baseline after each item and allocation stays predictable.</w:t>
+      </w:r>
+    </w:p>
+    <w:p>
+      <w:pPr>
+        <w:pStyle w:val="BodyText"/>
+      </w:pPr>
+      <w:r>
+        <w:t xml:space="preserve">Benchmarking measures character counts and latency for every document</w:t>
+      </w:r>
+    </w:p>
+    <w:p>
+      <w:pPr>
+        <w:pStyle w:val="BodyText"/>
+      </w:pPr>
+      <w:r>
+        <w:t xml:space="preserve">in the suite, and the results are reported in a machine-readable phase</w:t>
+      </w:r>
+    </w:p>
+    <w:p>
+      <w:pPr>
+        <w:pStyle w:val="BodyText"/>
+      </w:pPr>
+      <w:r>
+        <w:t xml:space="preserve">report that is verified by the delivery gate before completion.</w:t>
+      </w:r>
+    </w:p>
+    <w:p>
+      <w:pPr>
+        <w:pStyle w:val="BodyText"/>
+      </w:pPr>
+      <w:r>
+        <w:t xml:space="preserve">Native Rust compilation is delegated to the GitHub Actions runner while</w:t>
+      </w:r>
+    </w:p>
+    <w:p>
+      <w:pPr>
+        <w:pStyle w:val="BodyText"/>
+      </w:pPr>
+      <w:r>
+        <w:t xml:space="preserve">the local machine keeps a lightweight toolchain for scripts and tests.</w:t>
+      </w:r>
+    </w:p>
+    <w:p>
+      <w:pPr>
+        <w:pStyle w:val="BodyText"/>
+      </w:pPr>
+      <w:r>
+        <w:t xml:space="preserve">Artifacts are verified for presence and size before a phase report may</w:t>
+      </w:r>
+    </w:p>
+    <w:p>
+      <w:pPr>
+        <w:pStyle w:val="BodyText"/>
+      </w:pPr>
+      <w:r>
+        <w:t xml:space="preserve">be marked complete, and cache keys isolate test builds from releases.</w:t>
+      </w:r>
+    </w:p>
+    <w:p>
+      <w:pPr>
+        <w:pStyle w:val="BodyText"/>
+      </w:pPr>
+      <w:r>
+        <w:t xml:space="preserve">The graphical shell follows Apple design guidelines with a fixed window</w:t>
+      </w:r>
+    </w:p>
+    <w:p>
+      <w:pPr>
+        <w:pStyle w:val="BodyText"/>
+      </w:pPr>
+      <w:r>
+        <w:t xml:space="preserve">size, a deep dark theme, and minimalist status indicators.</w:t>
+      </w:r>
+    </w:p>
+    <w:p>
+      <w:pPr>
+        <w:pStyle w:val="BodyText"/>
+      </w:pPr>
+      <w:r>
+        <w:t xml:space="preserve">Documents with mixed scripts, complex tables, and embedded images are</w:t>
+      </w:r>
+    </w:p>
+    <w:p>
+      <w:pPr>
+        <w:pStyle w:val="BodyText"/>
+      </w:pPr>
+      <w:r>
+        <w:t xml:space="preserve">exercised so that regressions cannot hide behind toy-sized fixtures.</w:t>
+      </w:r>
+    </w:p>
+    <w:p>
+      <w:pPr>
+        <w:pStyle w:val="BodyText"/>
+      </w:pPr>
+      <w:r>
+        <w:t xml:space="preserve">Encrypted files return a structured failure, and password-protected</w:t>
+      </w:r>
+    </w:p>
+    <w:p>
+      <w:pPr>
+        <w:pStyle w:val="BodyText"/>
+      </w:pPr>
+      <w:r>
+        <w:t xml:space="preserve">content is never written to disk unless authentication succeeds.</w:t>
+      </w:r>
+    </w:p>
+    <w:p>
+      <w:pPr>
+        <w:pStyle w:val="BodyText"/>
+      </w:pPr>
+      <w:r>
+        <w:t xml:space="preserve">Long-running conversions can be cancelled by the user at any moment and</w:t>
+      </w:r>
+    </w:p>
+    <w:p>
+      <w:pPr>
+        <w:pStyle w:val="BodyText"/>
+      </w:pPr>
+      <w:r>
+        <w:t xml:space="preserve">the engine process is terminated promptly without leaking memory.</w:t>
+      </w:r>
+    </w:p>
+    <w:p>
+      <w:pPr>
+        <w:pStyle w:val="BodyText"/>
+      </w:pPr>
+      <w:r>
+        <w:t xml:space="preserve">The watchdog deadline protects the queue from pathological documents</w:t>
+      </w:r>
+    </w:p>
+    <w:p>
+      <w:pPr>
+        <w:pStyle w:val="BodyText"/>
+      </w:pPr>
+      <w:r>
+        <w:t xml:space="preserve">that would otherwise stall conversion for hours.</w:t>
+      </w:r>
+    </w:p>
+    <w:p>
+      <w:pPr>
+        <w:pStyle w:val="BodyText"/>
+      </w:pPr>
+      <w:r>
+        <w:t xml:space="preserve">Paths containing spaces are handled correctly on Windows, including</w:t>
+      </w:r>
+    </w:p>
+    <w:p>
+      <w:pPr>
+        <w:pStyle w:val="BodyText"/>
+      </w:pPr>
+      <w:r>
+        <w:t xml:space="preserve">folders such as My Documents that are common in real deployments.</w:t>
+      </w:r>
+    </w:p>
+    <w:p>
+      <w:pPr>
+        <w:pStyle w:val="BodyText"/>
+      </w:pPr>
+      <w:r>
+        <w:t xml:space="preserve">Every release artifact is a single lightweight installer that runs</w:t>
+      </w:r>
+    </w:p>
+    <w:p>
+      <w:pPr>
+        <w:pStyle w:val="BodyText"/>
+      </w:pPr>
+      <w:r>
+        <w:t xml:space="preserve">fully offline with no telemetry and no cloud dependency.</w:t>
+      </w:r>
+    </w:p>
+    <w:p>
+      <w:pPr>
+        <w:pStyle w:val="BodyText"/>
+      </w:pPr>
+      <w:r>
+        <w:t xml:space="preserve">This document verifies plain body text extraction at real-world scale.</w:t>
+      </w:r>
+    </w:p>
+    <w:p>
+      <w:pPr>
+        <w:pStyle w:val="BodyText"/>
+      </w:pPr>
+      <w:r>
+        <w:t xml:space="preserve">The pipeline must convert every paragraph to markdown without losing words</w:t>
+      </w:r>
+    </w:p>
+    <w:p>
+      <w:pPr>
+        <w:pStyle w:val="BodyText"/>
+      </w:pPr>
+      <w:r>
+        <w:t xml:space="preserve">or inserting phantom symbols, and it must do so deterministically.</w:t>
+      </w:r>
+    </w:p>
+    <w:p>
+      <w:pPr>
+        <w:pStyle w:val="BodyText"/>
+      </w:pPr>
+      <w:r>
+        <w:t xml:space="preserve">Sequential queue workers process files one by one so the memory footprint</w:t>
+      </w:r>
+    </w:p>
+    <w:p>
+      <w:pPr>
+        <w:pStyle w:val="BodyText"/>
+      </w:pPr>
+      <w:r>
+        <w:t xml:space="preserve">returns to baseline after each item and allocation stays predictable.</w:t>
+      </w:r>
+    </w:p>
+    <w:p>
+      <w:pPr>
+        <w:pStyle w:val="BodyText"/>
+      </w:pPr>
+      <w:r>
+        <w:t xml:space="preserve">Benchmarking measures character counts and latency for every document</w:t>
+      </w:r>
+    </w:p>
+    <w:p>
+      <w:pPr>
+        <w:pStyle w:val="BodyText"/>
+      </w:pPr>
+      <w:r>
+        <w:t xml:space="preserve">in the suite, and the results are reported in a machine-readable phase</w:t>
+      </w:r>
+    </w:p>
+    <w:p>
+      <w:pPr>
+        <w:pStyle w:val="BodyText"/>
+      </w:pPr>
+      <w:r>
+        <w:t xml:space="preserve">report that is verified by the delivery gate before completion.</w:t>
+      </w:r>
+    </w:p>
+    <w:p>
+      <w:pPr>
+        <w:pStyle w:val="BodyText"/>
+      </w:pPr>
+      <w:r>
+        <w:t xml:space="preserve">Native Rust compilation is delegated to the GitHub Actions runner while</w:t>
+      </w:r>
+    </w:p>
+    <w:p>
+      <w:pPr>
+        <w:pStyle w:val="BodyText"/>
+      </w:pPr>
+      <w:r>
+        <w:t xml:space="preserve">the local machine keeps a lightweight toolchain for scripts and tests.</w:t>
+      </w:r>
+    </w:p>
+    <w:p>
+      <w:pPr>
+        <w:pStyle w:val="BodyText"/>
+      </w:pPr>
+      <w:r>
+        <w:t xml:space="preserve">Artifacts are verified for presence and size before a phase report may</w:t>
+      </w:r>
+    </w:p>
+    <w:p>
+      <w:pPr>
+        <w:pStyle w:val="BodyText"/>
+      </w:pPr>
+      <w:r>
+        <w:t xml:space="preserve">be marked complete, and cache keys isolate test builds from releases.</w:t>
+      </w:r>
+    </w:p>
+    <w:p>
+      <w:pPr>
+        <w:pStyle w:val="BodyText"/>
+      </w:pPr>
+      <w:r>
+        <w:t xml:space="preserve">The graphical shell follows Apple design guidelines with a fixed window</w:t>
+      </w:r>
+    </w:p>
+    <w:p>
+      <w:pPr>
+        <w:pStyle w:val="BodyText"/>
+      </w:pPr>
+      <w:r>
+        <w:t xml:space="preserve">size, a deep dark theme, and minimalist status indicators.</w:t>
+      </w:r>
+    </w:p>
+    <w:p>
+      <w:pPr>
+        <w:pStyle w:val="BodyText"/>
+      </w:pPr>
+      <w:r>
+        <w:t xml:space="preserve">Documents with mixed scripts, complex tables, and embedded images are</w:t>
+      </w:r>
+    </w:p>
+    <w:p>
+      <w:pPr>
+        <w:pStyle w:val="BodyText"/>
+      </w:pPr>
+      <w:r>
+        <w:t xml:space="preserve">exercised so that regressions cannot hide behind toy-sized fixtures.</w:t>
+      </w:r>
+    </w:p>
+    <w:p>
+      <w:pPr>
+        <w:pStyle w:val="BodyText"/>
+      </w:pPr>
+      <w:r>
+        <w:t xml:space="preserve">Encrypted files return a structured failure, and password-protected</w:t>
+      </w:r>
+    </w:p>
+    <w:p>
+      <w:pPr>
+        <w:pStyle w:val="BodyText"/>
+      </w:pPr>
+      <w:r>
+        <w:t xml:space="preserve">content is never written to disk unless authentication succeeds.</w:t>
+      </w:r>
+    </w:p>
+    <w:p>
+      <w:pPr>
+        <w:pStyle w:val="BodyText"/>
+      </w:pPr>
+      <w:r>
+        <w:t xml:space="preserve">Long-running conversions can be cancelled by the user at any moment and</w:t>
+      </w:r>
+    </w:p>
+    <w:p>
+      <w:pPr>
+        <w:pStyle w:val="BodyText"/>
+      </w:pPr>
+      <w:r>
+        <w:t xml:space="preserve">the engine process is terminated promptly without leaking memory.</w:t>
+      </w:r>
+    </w:p>
+    <w:p>
+      <w:pPr>
+        <w:pStyle w:val="BodyText"/>
+      </w:pPr>
+      <w:r>
+        <w:t xml:space="preserve">The watchdog deadline protects the queue from pathological documents</w:t>
+      </w:r>
+    </w:p>
+    <w:p>
+      <w:pPr>
+        <w:pStyle w:val="BodyText"/>
+      </w:pPr>
+      <w:r>
+        <w:t xml:space="preserve">that would otherwise stall conversion for hours.</w:t>
+      </w:r>
+    </w:p>
+    <w:p>
+      <w:pPr>
+        <w:pStyle w:val="BodyText"/>
+      </w:pPr>
+      <w:r>
+        <w:t xml:space="preserve">Paths containing spaces are handled correctly on Windows, including</w:t>
+      </w:r>
+    </w:p>
+    <w:p>
+      <w:pPr>
+        <w:pStyle w:val="BodyText"/>
+      </w:pPr>
+      <w:r>
+        <w:t xml:space="preserve">folders such as My Documents that are common in real deployments.</w:t>
+      </w:r>
+    </w:p>
+    <w:p>
+      <w:pPr>
+        <w:pStyle w:val="BodyText"/>
+      </w:pPr>
+      <w:r>
+        <w:t xml:space="preserve">Every release artifact is a single lightweight installer that runs</w:t>
+      </w:r>
+    </w:p>
+    <w:p>
+      <w:pPr>
+        <w:pStyle w:val="BodyText"/>
+      </w:pPr>
+      <w:r>
+        <w:t xml:space="preserve">fully offline with no telemetry and no cloud dependency.</w:t>
+      </w:r>
     </w:p>
     <w:bookmarkEnd w:id="9"/>
     <w:sectPr>

</xml_diff>